<commit_message>
chore(content): remove the stray author line from Jenks-CW 2016.docx
The Word file had a standalone author line "Jaci Leigh Eisenberg" above the
version line. It doesn't match the citation's "Jaci L. Eisenberg", so the
parser couldn't recognise it as the author line and it showed up again after
the biography text. The client asked to remove it.

Byte-level edit: only word/document.xml changes (that paragraph and the empty
one after it, so one blank line remains as in the other entries); every other
part of the .docx is byte-identical and the entry order is unchanged.
LibreOffice and officeparser show exactly that line and the blank after it
removed. On the site only that line disappears; the byline and citation still
read "Jaci L. Eisenberg". Jenks gets a new content hash (sandbox Zenodo new
version).
</commit_message>
<xml_diff>
--- a/src/content/bios/Jenks-CW 2016.docx
+++ b/src/content/bios/Jenks-CW 2016.docx
@@ -4282,35 +4282,6 @@
           <w:lang w:val="en-GB"/>
         </w:rPr>
         <w:t>22 January 2016).</w:t>
-      </w:r>
-    </w:p>
-    <w:p>
-      <w:pPr>
-        <w:jc w:val="both"/>
-        <w:rPr>
-          <w:szCs w:val="24"/>
-          <w:lang w:val="en-GB"/>
-        </w:rPr>
-      </w:pPr>
-    </w:p>
-    <w:p>
-      <w:pPr>
-        <w:jc w:val="both"/>
-        <w:rPr>
-          <w:b/>
-          <w:bCs/>
-          <w:szCs w:val="24"/>
-          <w:lang w:val="en-GB"/>
-        </w:rPr>
-      </w:pPr>
-      <w:r>
-        <w:rPr>
-          <w:b/>
-          <w:bCs/>
-          <w:szCs w:val="24"/>
-          <w:lang w:val="en-GB"/>
-        </w:rPr>
-        <w:t>Jaci Leigh Eisenberg</w:t>
       </w:r>
     </w:p>
     <w:p>

</xml_diff>